<commit_message>
update report and r code
</commit_message>
<xml_diff>
--- a/Report/Data_Science_Report.docx
+++ b/Report/Data_Science_Report.docx
@@ -1311,20 +1311,27 @@
         </w:rPr>
         <w:drawing>
           <wp:inline distT="0" distB="0" distL="0" distR="0">
-            <wp:extent cx="5943600" cy="2724150"/>
-            <wp:effectExtent l="0" t="0" r="0" b="0"/>
-            <wp:docPr id="7" name="image4.png"/>
-            <wp:cNvGraphicFramePr/>
+            <wp:extent cx="5943600" cy="2774950"/>
+            <wp:effectExtent l="0" t="0" r="0" b="6350"/>
+            <wp:docPr id="973280602" name="Picture 1"/>
+            <wp:cNvGraphicFramePr>
+              <a:graphicFrameLocks xmlns:a="http://schemas.openxmlformats.org/drawingml/2006/main" noChangeAspect="1"/>
+            </wp:cNvGraphicFramePr>
             <a:graphic xmlns:a="http://schemas.openxmlformats.org/drawingml/2006/main">
               <a:graphicData uri="http://schemas.openxmlformats.org/drawingml/2006/picture">
                 <pic:pic xmlns:pic="http://schemas.openxmlformats.org/drawingml/2006/picture">
                   <pic:nvPicPr>
-                    <pic:cNvPr id="0" name="image4.png"/>
-                    <pic:cNvPicPr preferRelativeResize="0"/>
+                    <pic:cNvPr id="973280602" name="Picture 973280602"/>
+                    <pic:cNvPicPr/>
                   </pic:nvPicPr>
                   <pic:blipFill>
-                    <a:blip r:embed="rId15"/>
-                    <a:srcRect/>
+                    <a:blip r:embed="rId15" cstate="print">
+                      <a:extLst>
+                        <a:ext uri="{28A0092B-C50C-407E-A947-70E740481C1C}">
+                          <a14:useLocalDpi xmlns:a14="http://schemas.microsoft.com/office/drawing/2010/main" val="0"/>
+                        </a:ext>
+                      </a:extLst>
+                    </a:blip>
                     <a:stretch>
                       <a:fillRect/>
                     </a:stretch>
@@ -1332,12 +1339,11 @@
                   <pic:spPr>
                     <a:xfrm>
                       <a:off x="0" y="0"/>
-                      <a:ext cx="5943600" cy="2724150"/>
+                      <a:ext cx="5943600" cy="2774950"/>
                     </a:xfrm>
                     <a:prstGeom prst="rect">
                       <a:avLst/>
                     </a:prstGeom>
-                    <a:ln/>
                   </pic:spPr>
                 </pic:pic>
               </a:graphicData>

</xml_diff>